<commit_message>
Expand NUXERA manuals and refresh deliverables
</commit_message>
<xml_diff>
--- a/docs/nuxera-migration/docs/migration/deliverables/2026-07-29/NUXERA_English_Package_2026-07-29/NUXERA_DETAILED_FUNCTIONAL_MANUAL_2026-07-29_EN.docx
+++ b/docs/nuxera-migration/docs/migration/deliverables/2026-07-29/NUXERA_English_Package_2026-07-29/NUXERA_DETAILED_FUNCTIONAL_MANUAL_2026-07-29_EN.docx
@@ -13,7 +13,7 @@
           <w:color w:val="0B2545"/>
           <w:sz w:val="48"/>
         </w:rPr>
-        <w:t>NUXERA - Detailed Functional Manual</w:t>
+        <w:t>NUXERA - Extended Functional Manual</w:t>
       </w:r>
     </w:p>
     <w:p>
@@ -237,15 +237,7 @@
           <w:rFonts w:ascii="Calibri" w:hAnsi="Calibri"/>
           <w:sz w:val="22"/>
         </w:rPr>
-        <w:t>Date: 2026-07-29 Audience: business specialists, compliance teams, originators, funding providers, commercial teams and investors. Status: live NUXERA experience for demonstration, with sensitive operations protected by gates and final production evidence still pending.</w:t>
-      </w:r>
-    </w:p>
-    <w:p>
-      <w:pPr>
-        <w:pStyle w:val="Heading1"/>
-      </w:pPr>
-      <w:r>
-        <w:t>1. What NUXERA Is</w:t>
+        <w:t>Fecha/Date: 2026-07-29 Audiencia/Audience: negocio, cumplimiento, usuarios operativos, socios e inversionistas.</w:t>
       </w:r>
     </w:p>
     <w:p>
@@ -254,7 +246,15 @@
           <w:rFonts w:ascii="Calibri" w:hAnsi="Calibri"/>
           <w:sz w:val="22"/>
         </w:rPr>
-        <w:t>NUXERA is a financial intelligence and compliance platform for preparing, reviewing and monitoring financing files. Its core purpose is to transform scattered information about a company, project, beneficial owners, documents and jurisdictional context into a structured file that humans can review and defend.</w:t>
+        <w:t>Este documento reemplaza el manual corto previo. Su objetivo es explicar NUXERA como plataforma operativa, no como resumen ejecutivo: que hace cada area, como entrar, que datos se capturan, como se cargan documents, que revisa el funding provider, como actua administracion, que hacen agentes/notificaciones y que resultado produce cada ciclo.</w:t>
+      </w:r>
+    </w:p>
+    <w:p>
+      <w:pPr>
+        <w:pStyle w:val="Heading1"/>
+      </w:pPr>
+      <w:r>
+        <w:t>1. Concepto general</w:t>
       </w:r>
     </w:p>
     <w:p>
@@ -263,7 +263,107 @@
           <w:rFonts w:ascii="Calibri" w:hAnsi="Calibri"/>
           <w:sz w:val="22"/>
         </w:rPr>
-        <w:t>NUXERA is not an automatic credit approval engine. It is a controlled operating layer that organizes evidence, exposes gaps, triggers reviews, prepares decision packets and records what is known, what is missing and what requires external validation.</w:t>
+        <w:t>NUXERA organiza files de financiamiento con evidencia, cumplimiento, riesgo y revision humana. No aprueba credito automaticamente. La plataforma separa pagina publica, applicants, funding providers y administracion para evitar que captura, analisis y control se mezclen. El resultado esperado es un file defendible, trazable y listo para comite humano.</w:t>
+      </w:r>
+    </w:p>
+    <w:p>
+      <w:pPr>
+        <w:pStyle w:val="Heading1"/>
+      </w:pPr>
+      <w:r>
+        <w:t>2. Principios de operacion</w:t>
+      </w:r>
+    </w:p>
+    <w:p>
+      <w:pPr>
+        <w:pStyle w:val="ListBullet"/>
+      </w:pPr>
+      <w:r>
+        <w:rPr>
+          <w:rFonts w:ascii="Calibri" w:hAnsi="Calibri"/>
+          <w:sz w:val="22"/>
+        </w:rPr>
+        <w:t>La decision final siempre corresponde a humanos autorizados</w:t>
+      </w:r>
+    </w:p>
+    <w:p>
+      <w:pPr>
+        <w:pStyle w:val="ListBullet"/>
+      </w:pPr>
+      <w:r>
+        <w:rPr>
+          <w:rFonts w:ascii="Calibri" w:hAnsi="Calibri"/>
+          <w:sz w:val="22"/>
+        </w:rPr>
+        <w:t>Todo dato importante debe tener fuente, documento, usuario, fecha o evento</w:t>
+      </w:r>
+    </w:p>
+    <w:p>
+      <w:pPr>
+        <w:pStyle w:val="ListBullet"/>
+      </w:pPr>
+      <w:r>
+        <w:rPr>
+          <w:rFonts w:ascii="Calibri" w:hAnsi="Calibri"/>
+          <w:sz w:val="22"/>
+        </w:rPr>
+        <w:t>Los roles se separan por permisos y RLS</w:t>
+      </w:r>
+    </w:p>
+    <w:p>
+      <w:pPr>
+        <w:pStyle w:val="ListBullet"/>
+      </w:pPr>
+      <w:r>
+        <w:rPr>
+          <w:rFonts w:ascii="Calibri" w:hAnsi="Calibri"/>
+          <w:sz w:val="22"/>
+        </w:rPr>
+        <w:t>Los documents sensibles no se adjuntan por correo por defecto</w:t>
+      </w:r>
+    </w:p>
+    <w:p>
+      <w:pPr>
+        <w:pStyle w:val="ListBullet"/>
+      </w:pPr>
+      <w:r>
+        <w:rPr>
+          <w:rFonts w:ascii="Calibri" w:hAnsi="Calibri"/>
+          <w:sz w:val="22"/>
+        </w:rPr>
+        <w:t>El agente solo usa contexto autorizado</w:t>
+      </w:r>
+    </w:p>
+    <w:p>
+      <w:pPr>
+        <w:pStyle w:val="ListBullet"/>
+      </w:pPr>
+      <w:r>
+        <w:rPr>
+          <w:rFonts w:ascii="Calibri" w:hAnsi="Calibri"/>
+          <w:sz w:val="22"/>
+        </w:rPr>
+        <w:t>Las fuentes externas muestran alcance y limitaciones</w:t>
+      </w:r>
+    </w:p>
+    <w:p>
+      <w:pPr>
+        <w:pStyle w:val="ListBullet"/>
+      </w:pPr>
+      <w:r>
+        <w:rPr>
+          <w:rFonts w:ascii="Calibri" w:hAnsi="Calibri"/>
+          <w:sz w:val="22"/>
+        </w:rPr>
+        <w:t>Demo e investor-ready no equivalen a production con datos reales</w:t>
+      </w:r>
+    </w:p>
+    <w:p>
+      <w:pPr>
+        <w:pStyle w:val="Heading1"/>
+      </w:pPr>
+      <w:r>
+        <w:t>3. Public site</w:t>
       </w:r>
     </w:p>
     <w:p>
@@ -272,15 +372,15 @@
           <w:rFonts w:ascii="Calibri" w:hAnsi="Calibri"/>
           <w:sz w:val="22"/>
         </w:rPr>
-        <w:t>The platform has four main surfaces: public site, applicant workspace, funding provider workspace and administration.</w:t>
+        <w:t>La pagina publica presenta NUXERA al mercado. No carga documents sensibles ni genera score; explica propuesta de valor, cobertura global, industrias, integraciones e implementacion.</w:t>
       </w:r>
     </w:p>
     <w:p>
       <w:pPr>
-        <w:pStyle w:val="Heading1"/>
+        <w:pStyle w:val="Heading3"/>
       </w:pPr>
       <w:r>
-        <w:t>2. Public Site</w:t>
+        <w:t>Como operar esta vista</w:t>
       </w:r>
     </w:p>
     <w:p>
@@ -289,7 +389,15 @@
           <w:rFonts w:ascii="Calibri" w:hAnsi="Calibri"/>
           <w:sz w:val="22"/>
         </w:rPr>
-        <w:t>The public site is the commercial and institutional entry point. It explains NUXERA as a global compliance and risk platform for evidence-based financial decisions.</w:t>
+        <w:t>1. Abrir URL publica 2. Verificar marca NUXERA Financial Intelligence 3. Cambiar idioma ES/EN si aplica 4. Revisar Home, Platform, Global coverage, Industries, Integrations e Implementation 5. Entrar a Login o Sign Up solo cuando el usuario pasara a workspace</w:t>
+      </w:r>
+    </w:p>
+    <w:p>
+      <w:pPr>
+        <w:pStyle w:val="Heading1"/>
+      </w:pPr>
+      <w:r>
+        <w:t>4. Workspace de applicants</w:t>
       </w:r>
     </w:p>
     <w:p>
@@ -298,7 +406,15 @@
           <w:rFonts w:ascii="Calibri" w:hAnsi="Calibri"/>
           <w:sz w:val="22"/>
         </w:rPr>
-        <w:t>How to use it:</w:t>
+        <w:t>El workspace de applicants prepara el file antes de compartirlo. Debe contestar que falta, que documents subir, que riesgos estan abiertos y que sigue.</w:t>
+      </w:r>
+    </w:p>
+    <w:p>
+      <w:pPr>
+        <w:pStyle w:val="Heading3"/>
+      </w:pPr>
+      <w:r>
+        <w:t>Ingreso y primera lectura</w:t>
       </w:r>
     </w:p>
     <w:p>
@@ -307,7 +423,15 @@
           <w:rFonts w:ascii="Calibri" w:hAnsi="Calibri"/>
           <w:sz w:val="22"/>
         </w:rPr>
-        <w:t>1. Open the public NUXERA URL. 2. Review the value proposition, global coverage, industries, integrations and implementation model. 3. Switch between Spanish and English for local or international presentations. 4. Use Login or Sign Up to move from public information into the operational workspace.</w:t>
+        <w:t>1. Iniciar sesion como applicant 2. Abrir dashboard 3. Confirmar NUXERA / Applicant o Applicant 4. Revisar readiness 5. Entrar a empresa, responsables, proyecto, documents y seguimiento</w:t>
+      </w:r>
+    </w:p>
+    <w:p>
+      <w:pPr>
+        <w:pStyle w:val="Heading3"/>
+      </w:pPr>
+      <w:r>
+        <w:t>Empresa y responsables</w:t>
       </w:r>
     </w:p>
     <w:p>
@@ -316,7 +440,7 @@
           <w:rFonts w:ascii="Calibri" w:hAnsi="Calibri"/>
           <w:sz w:val="22"/>
         </w:rPr>
-        <w:t>What each area does:</w:t>
+        <w:t>Captura nombre legal, pais, registro, domicilio, sector, representante, beneficiarios finales y contactos. Documentos tipicos:</w:t>
       </w:r>
     </w:p>
     <w:p>
@@ -328,7 +452,7 @@
           <w:rFonts w:ascii="Calibri" w:hAnsi="Calibri"/>
           <w:sz w:val="22"/>
         </w:rPr>
-        <w:t>Home: presents identity, product promise and summary capabilities.</w:t>
+        <w:t>Acta constitutiva o registro equivalente</w:t>
       </w:r>
     </w:p>
     <w:p>
@@ -340,7 +464,7 @@
           <w:rFonts w:ascii="Calibri" w:hAnsi="Calibri"/>
           <w:sz w:val="22"/>
         </w:rPr>
-        <w:t>Platform: explains the system as a file, intelligence and traceability workspace.</w:t>
+        <w:t>Poderes y representante legal</w:t>
       </w:r>
     </w:p>
     <w:p>
@@ -352,7 +476,7 @@
           <w:rFonts w:ascii="Calibri" w:hAnsi="Calibri"/>
           <w:sz w:val="22"/>
         </w:rPr>
-        <w:t>Global coverage: presents the jurisdictional and regulatory coverage logic.</w:t>
+        <w:t>Identificacion de responsables y beneficiarios finales</w:t>
       </w:r>
     </w:p>
     <w:p>
@@ -364,7 +488,7 @@
           <w:rFonts w:ascii="Calibri" w:hAnsi="Calibri"/>
           <w:sz w:val="22"/>
         </w:rPr>
-        <w:t>Industries: shows sectors that can prepare funding files.</w:t>
+        <w:t>Comprobante fiscal o numero tributario</w:t>
       </w:r>
     </w:p>
     <w:p>
@@ -376,7 +500,7 @@
           <w:rFonts w:ascii="Calibri" w:hAnsi="Calibri"/>
           <w:sz w:val="22"/>
         </w:rPr>
-        <w:t>Integrations: communicates connection potential with APIs, public sources, AI providers, email and regulatory registers.</w:t>
+        <w:t>Registro mercantil o licencia comercial</w:t>
       </w:r>
     </w:p>
     <w:p>
@@ -388,7 +512,19 @@
           <w:rFonts w:ascii="Calibri" w:hAnsi="Calibri"/>
           <w:sz w:val="22"/>
         </w:rPr>
-        <w:t>Implementation: frames onboarding and migration.</w:t>
+        <w:t>Estructura accionaria</w:t>
+      </w:r>
+    </w:p>
+    <w:p>
+      <w:pPr>
+        <w:pStyle w:val="ListBullet"/>
+      </w:pPr>
+      <w:r>
+        <w:rPr>
+          <w:rFonts w:ascii="Calibri" w:hAnsi="Calibri"/>
+          <w:sz w:val="22"/>
+        </w:rPr>
+        <w:t>Estados financieros</w:t>
       </w:r>
     </w:p>
     <w:p>
@@ -397,15 +533,15 @@
           <w:rFonts w:ascii="Calibri" w:hAnsi="Calibri"/>
           <w:sz w:val="22"/>
         </w:rPr>
-        <w:t>Expected result: visitors understand NUXERA as a compliance and financial intelligence platform, not just a financing landing page.</w:t>
+        <w:t>NUXERA clasifica, marca faltantes, alimenta checklist y prepara senales para funding provider.</w:t>
       </w:r>
     </w:p>
     <w:p>
       <w:pPr>
-        <w:pStyle w:val="Heading1"/>
+        <w:pStyle w:val="Heading3"/>
       </w:pPr>
       <w:r>
-        <w:t>3. Applicant Workspace</w:t>
+        <w:t>Proyecto y uso de fondos</w:t>
       </w:r>
     </w:p>
     <w:p>
@@ -414,7 +550,99 @@
           <w:rFonts w:ascii="Calibri" w:hAnsi="Calibri"/>
           <w:sz w:val="22"/>
         </w:rPr>
-        <w:t>The applicant workspace is where a company, sponsor or project owner prepares the file before requesting capital.</w:t>
+        <w:t>Captura ubicacion pais/estado/ciudad, sector, monto, moneda, uso de fondos, etapa, plazo, garantias, modelo, impacto y permisos. Documentos tipicos:</w:t>
+      </w:r>
+    </w:p>
+    <w:p>
+      <w:pPr>
+        <w:pStyle w:val="ListBullet"/>
+      </w:pPr>
+      <w:r>
+        <w:rPr>
+          <w:rFonts w:ascii="Calibri" w:hAnsi="Calibri"/>
+          <w:sz w:val="22"/>
+        </w:rPr>
+        <w:t>Modelo financiero</w:t>
+      </w:r>
+    </w:p>
+    <w:p>
+      <w:pPr>
+        <w:pStyle w:val="ListBullet"/>
+      </w:pPr>
+      <w:r>
+        <w:rPr>
+          <w:rFonts w:ascii="Calibri" w:hAnsi="Calibri"/>
+          <w:sz w:val="22"/>
+        </w:rPr>
+        <w:t>Presupuesto de inversion</w:t>
+      </w:r>
+    </w:p>
+    <w:p>
+      <w:pPr>
+        <w:pStyle w:val="ListBullet"/>
+      </w:pPr>
+      <w:r>
+        <w:rPr>
+          <w:rFonts w:ascii="Calibri" w:hAnsi="Calibri"/>
+          <w:sz w:val="22"/>
+        </w:rPr>
+        <w:t>Permisos y licencias</w:t>
+      </w:r>
+    </w:p>
+    <w:p>
+      <w:pPr>
+        <w:pStyle w:val="ListBullet"/>
+      </w:pPr>
+      <w:r>
+        <w:rPr>
+          <w:rFonts w:ascii="Calibri" w:hAnsi="Calibri"/>
+          <w:sz w:val="22"/>
+        </w:rPr>
+        <w:t>Contratos relevantes</w:t>
+      </w:r>
+    </w:p>
+    <w:p>
+      <w:pPr>
+        <w:pStyle w:val="ListBullet"/>
+      </w:pPr>
+      <w:r>
+        <w:rPr>
+          <w:rFonts w:ascii="Calibri" w:hAnsi="Calibri"/>
+          <w:sz w:val="22"/>
+        </w:rPr>
+        <w:t>Evidencia tecnica</w:t>
+      </w:r>
+    </w:p>
+    <w:p>
+      <w:pPr>
+        <w:pStyle w:val="ListBullet"/>
+      </w:pPr>
+      <w:r>
+        <w:rPr>
+          <w:rFonts w:ascii="Calibri" w:hAnsi="Calibri"/>
+          <w:sz w:val="22"/>
+        </w:rPr>
+        <w:t>Garantias</w:t>
+      </w:r>
+    </w:p>
+    <w:p>
+      <w:pPr>
+        <w:pStyle w:val="ListBullet"/>
+      </w:pPr>
+      <w:r>
+        <w:rPr>
+          <w:rFonts w:ascii="Calibri" w:hAnsi="Calibri"/>
+          <w:sz w:val="22"/>
+        </w:rPr>
+        <w:t>Informacion ESG o impacto</w:t>
+      </w:r>
+    </w:p>
+    <w:p>
+      <w:pPr>
+        <w:pStyle w:val="Heading3"/>
+      </w:pPr>
+      <w:r>
+        <w:t>Carga documental paso a paso</w:t>
       </w:r>
     </w:p>
     <w:p>
@@ -423,7 +651,7 @@
           <w:rFonts w:ascii="Calibri" w:hAnsi="Calibri"/>
           <w:sz w:val="22"/>
         </w:rPr>
-        <w:t>How to enter:</w:t>
+        <w:t>1. Seleccionar requisito o categoria 2. Subir archivo 3. Asociar a requisito 4. Confirmar version, fecha y responsable 5. Esperar estado recibido/en revision/observado/passed 6. Atender observacion o cargar nueva version</w:t>
       </w:r>
     </w:p>
     <w:p>
@@ -432,7 +660,15 @@
           <w:rFonts w:ascii="Calibri" w:hAnsi="Calibri"/>
           <w:sz w:val="22"/>
         </w:rPr>
-        <w:t>1. Sign in as applicant. 2. Open the dashboard. 3. Confirm the shell reads NUXERA / Applicant. 4. Review the overall readiness state.</w:t>
+        <w:t>Categorias: identidad, corporativo, fiscal, financiero, legal, tecnico, proyecto, garantias, cumplimiento, regulatorio, impacto y evidencia complementaria.</w:t>
+      </w:r>
+    </w:p>
+    <w:p>
+      <w:pPr>
+        <w:pStyle w:val="Heading3"/>
+      </w:pPr>
+      <w:r>
+        <w:t>Score, seguimiento y agente</w:t>
       </w:r>
     </w:p>
     <w:p>
@@ -441,7 +677,15 @@
           <w:rFonts w:ascii="Calibri" w:hAnsi="Calibri"/>
           <w:sz w:val="22"/>
         </w:rPr>
-        <w:t>Recommended workflow:</w:t>
+        <w:t>Readiness mide preparacion, no aprobacion. El agente puede explicar faltantes y requisitos, pero no promete condiciones, no aprueba financiamiento, no inventa datos y no muestra informacion de otros usuarios.</w:t>
+      </w:r>
+    </w:p>
+    <w:p>
+      <w:pPr>
+        <w:pStyle w:val="Heading1"/>
+      </w:pPr>
+      <w:r>
+        <w:t>5. Workspace de funding providers</w:t>
       </w:r>
     </w:p>
     <w:p>
@@ -450,7 +694,15 @@
           <w:rFonts w:ascii="Calibri" w:hAnsi="Calibri"/>
           <w:sz w:val="22"/>
         </w:rPr>
-        <w:t>1. Complete company and responsible-party profile. Add legal entity details, corporate structure, representatives, beneficial owners and file owners. 2. Prepare project information. Explain funding amount, use of funds, location, sector, impact, maturity and financial assumptions. 3. Upload documents. Depending on the file type, documents may include corporate, tax, financial, identity, permits, contracts, collateral, technical and compliance evidence. 4. Review gaps. NUXERA shows missing data or documents required for review. 5. Resolve observations. When the funding provider or system marks a gap, the applicant uploads, corrects or explains the evidence. 6. Track progress. The applicant follows status, next steps, open risks and pending requests.</w:t>
+        <w:t>El workspace de funding providers transforma files autorizados en analisis, comite y seguimiento. No debe duplicar la pantalla de applicant.</w:t>
+      </w:r>
+    </w:p>
+    <w:p>
+      <w:pPr>
+        <w:pStyle w:val="Heading3"/>
+      </w:pPr>
+      <w:r>
+        <w:t>Decision desk</w:t>
       </w:r>
     </w:p>
     <w:p>
@@ -459,55 +711,15 @@
           <w:rFonts w:ascii="Calibri" w:hAnsi="Calibri"/>
           <w:sz w:val="22"/>
         </w:rPr>
-        <w:t>Document upload behavior:</w:t>
+        <w:t>Prepara paquete de decision no vinculante: resumen, evidencia, riesgos, preguntas de comite, condiciones humanas, fuentes y limitaciones.</w:t>
       </w:r>
     </w:p>
     <w:p>
       <w:pPr>
-        <w:pStyle w:val="ListBullet"/>
+        <w:pStyle w:val="Heading3"/>
       </w:pPr>
       <w:r>
-        <w:rPr>
-          <w:rFonts w:ascii="Calibri" w:hAnsi="Calibri"/>
-          <w:sz w:val="22"/>
-        </w:rPr>
-        <w:t>Each document should be mapped to a category and requirement.</w:t>
-      </w:r>
-    </w:p>
-    <w:p>
-      <w:pPr>
-        <w:pStyle w:val="ListBullet"/>
-      </w:pPr>
-      <w:r>
-        <w:rPr>
-          <w:rFonts w:ascii="Calibri" w:hAnsi="Calibri"/>
-          <w:sz w:val="22"/>
-        </w:rPr>
-        <w:t>Metadata should include type, date, owner, version, linked requirement and review status.</w:t>
-      </w:r>
-    </w:p>
-    <w:p>
-      <w:pPr>
-        <w:pStyle w:val="ListBullet"/>
-      </w:pPr>
-      <w:r>
-        <w:rPr>
-          <w:rFonts w:ascii="Calibri" w:hAnsi="Calibri"/>
-          <w:sz w:val="22"/>
-        </w:rPr>
-        <w:t>Documents must not be emailed automatically or exposed to a funding provider without authorization rules.</w:t>
-      </w:r>
-    </w:p>
-    <w:p>
-      <w:pPr>
-        <w:pStyle w:val="ListBullet"/>
-      </w:pPr>
-      <w:r>
-        <w:rPr>
-          <w:rFonts w:ascii="Calibri" w:hAnsi="Calibri"/>
-          <w:sz w:val="22"/>
-        </w:rPr>
-        <w:t>In production, evidence must persist through secure storage, RLS and access logs.</w:t>
+        <w:t>Case management</w:t>
       </w:r>
     </w:p>
     <w:p>
@@ -516,15 +728,15 @@
           <w:rFonts w:ascii="Calibri" w:hAnsi="Calibri"/>
           <w:sz w:val="22"/>
         </w:rPr>
-        <w:t>Expected result: a structured funding file with visible gaps, categorized documents and clear conditions before funding-provider review.</w:t>
+        <w:t>Mueve el caso: responsable, SLA, faltantes, solicitudes, files detenidos e intervencion humana. Decision desk mira la decision; Case management mueve la operacion.</w:t>
       </w:r>
     </w:p>
     <w:p>
       <w:pPr>
-        <w:pStyle w:val="Heading1"/>
+        <w:pStyle w:val="Heading3"/>
       </w:pPr>
       <w:r>
-        <w:t>4. Funding Provider Workspace</w:t>
+        <w:t>Finance e intelligence</w:t>
       </w:r>
     </w:p>
     <w:p>
@@ -533,7 +745,15 @@
           <w:rFonts w:ascii="Calibri" w:hAnsi="Calibri"/>
           <w:sz w:val="22"/>
         </w:rPr>
-        <w:t>The funding provider workspace is for authorized reviewers: funds, banks, lenders, analysts, family offices and investment committees.</w:t>
+        <w:t>Finance revisa monto, moneda, uso de fondos, repago, garantias, modelo y sensibilidad. Intelligence revisa empresa, representantes, beneficiarios, sanciones, reputacion, fuentes abiertas y hallazgos trazados.</w:t>
+      </w:r>
+    </w:p>
+    <w:p>
+      <w:pPr>
+        <w:pStyle w:val="Heading3"/>
+      </w:pPr>
+      <w:r>
+        <w:t>Pais, ciudad y contexto</w:t>
       </w:r>
     </w:p>
     <w:p>
@@ -542,7 +762,15 @@
           <w:rFonts w:ascii="Calibri" w:hAnsi="Calibri"/>
           <w:sz w:val="22"/>
         </w:rPr>
-        <w:t>How to enter:</w:t>
+        <w:t>Debe analizar dimensiones economico, politico, social, regulatorio, territorial. El flujo es: ubicacion capturada por applicant, fuente publica/API, separacion de datos confirmados y pendientes, resumen para funding provider con fecha, fuente, alcance y limitacion.</w:t>
+      </w:r>
+    </w:p>
+    <w:p>
+      <w:pPr>
+        <w:pStyle w:val="Heading3"/>
+      </w:pPr>
+      <w:r>
+        <w:t>Medio Oriente y EAU</w:t>
       </w:r>
     </w:p>
     <w:p>
@@ -551,7 +779,163 @@
           <w:rFonts w:ascii="Calibri" w:hAnsi="Calibri"/>
           <w:sz w:val="22"/>
         </w:rPr>
-        <w:t>1. Sign in as funding provider. 2. Use Decision desk for executive and committee review. 3. Use Case management for operational follow-up, ownership and SLAs. 4. Use Finance, Intelligence, Markets or Strategy according to the review need.</w:t>
+        <w:t>Fuentes consideradas:</w:t>
+      </w:r>
+    </w:p>
+    <w:p>
+      <w:pPr>
+        <w:pStyle w:val="ListBullet"/>
+      </w:pPr>
+      <w:r>
+        <w:rPr>
+          <w:rFonts w:ascii="Calibri" w:hAnsi="Calibri"/>
+          <w:sz w:val="22"/>
+        </w:rPr>
+        <w:t>UAE PASS</w:t>
+      </w:r>
+    </w:p>
+    <w:p>
+      <w:pPr>
+        <w:pStyle w:val="ListBullet"/>
+      </w:pPr>
+      <w:r>
+        <w:rPr>
+          <w:rFonts w:ascii="Calibri" w:hAnsi="Calibri"/>
+          <w:sz w:val="22"/>
+        </w:rPr>
+        <w:t>EOCN</w:t>
+      </w:r>
+    </w:p>
+    <w:p>
+      <w:pPr>
+        <w:pStyle w:val="ListBullet"/>
+      </w:pPr>
+      <w:r>
+        <w:rPr>
+          <w:rFonts w:ascii="Calibri" w:hAnsi="Calibri"/>
+          <w:sz w:val="22"/>
+        </w:rPr>
+        <w:t>SCA/CMA</w:t>
+      </w:r>
+    </w:p>
+    <w:p>
+      <w:pPr>
+        <w:pStyle w:val="ListBullet"/>
+      </w:pPr>
+      <w:r>
+        <w:rPr>
+          <w:rFonts w:ascii="Calibri" w:hAnsi="Calibri"/>
+          <w:sz w:val="22"/>
+        </w:rPr>
+        <w:t>CBUAE</w:t>
+      </w:r>
+    </w:p>
+    <w:p>
+      <w:pPr>
+        <w:pStyle w:val="ListBullet"/>
+      </w:pPr>
+      <w:r>
+        <w:rPr>
+          <w:rFonts w:ascii="Calibri" w:hAnsi="Calibri"/>
+          <w:sz w:val="22"/>
+        </w:rPr>
+        <w:t>DFSA</w:t>
+      </w:r>
+    </w:p>
+    <w:p>
+      <w:pPr>
+        <w:pStyle w:val="ListBullet"/>
+      </w:pPr>
+      <w:r>
+        <w:rPr>
+          <w:rFonts w:ascii="Calibri" w:hAnsi="Calibri"/>
+          <w:sz w:val="22"/>
+        </w:rPr>
+        <w:t>FSRA/ADGM</w:t>
+      </w:r>
+    </w:p>
+    <w:p>
+      <w:pPr>
+        <w:pStyle w:val="ListBullet"/>
+      </w:pPr>
+      <w:r>
+        <w:rPr>
+          <w:rFonts w:ascii="Calibri" w:hAnsi="Calibri"/>
+          <w:sz w:val="22"/>
+        </w:rPr>
+        <w:t>ADGM Registration Authority</w:t>
+      </w:r>
+    </w:p>
+    <w:p>
+      <w:pPr>
+        <w:pStyle w:val="ListBullet"/>
+      </w:pPr>
+      <w:r>
+        <w:rPr>
+          <w:rFonts w:ascii="Calibri" w:hAnsi="Calibri"/>
+          <w:sz w:val="22"/>
+        </w:rPr>
+        <w:t>VARA</w:t>
+      </w:r>
+    </w:p>
+    <w:p>
+      <w:pPr>
+        <w:pStyle w:val="ListBullet"/>
+      </w:pPr>
+      <w:r>
+        <w:rPr>
+          <w:rFonts w:ascii="Calibri" w:hAnsi="Calibri"/>
+          <w:sz w:val="22"/>
+        </w:rPr>
+        <w:t>FTA</w:t>
+      </w:r>
+    </w:p>
+    <w:p>
+      <w:pPr>
+        <w:pStyle w:val="ListBullet"/>
+      </w:pPr>
+      <w:r>
+        <w:rPr>
+          <w:rFonts w:ascii="Calibri" w:hAnsi="Calibri"/>
+          <w:sz w:val="22"/>
+        </w:rPr>
+        <w:t>National Economic Registry</w:t>
+      </w:r>
+    </w:p>
+    <w:p>
+      <w:pPr>
+        <w:pStyle w:val="ListBullet"/>
+      </w:pPr>
+      <w:r>
+        <w:rPr>
+          <w:rFonts w:ascii="Calibri" w:hAnsi="Calibri"/>
+          <w:sz w:val="22"/>
+        </w:rPr>
+        <w:t>DET/DED Dubai</w:t>
+      </w:r>
+    </w:p>
+    <w:p>
+      <w:pPr>
+        <w:pStyle w:val="ListBullet"/>
+      </w:pPr>
+      <w:r>
+        <w:rPr>
+          <w:rFonts w:ascii="Calibri" w:hAnsi="Calibri"/>
+          <w:sz w:val="22"/>
+        </w:rPr>
+        <w:t>ADDED Abu Dhabi</w:t>
+      </w:r>
+    </w:p>
+    <w:p>
+      <w:pPr>
+        <w:pStyle w:val="ListBullet"/>
+      </w:pPr>
+      <w:r>
+        <w:rPr>
+          <w:rFonts w:ascii="Calibri" w:hAnsi="Calibri"/>
+          <w:sz w:val="22"/>
+        </w:rPr>
+        <w:t>registros economicos locales</w:t>
       </w:r>
     </w:p>
     <w:p>
@@ -560,31 +944,15 @@
           <w:rFonts w:ascii="Calibri" w:hAnsi="Calibri"/>
           <w:sz w:val="22"/>
         </w:rPr>
-        <w:t>Decision desk vs Case management:</w:t>
+        <w:t>En applicant alimentan checklist y score sin saturar. En funding provider se muestran explicitamente con alcance, estatus, tipo de acceso, limitacion y siguiente accion.</w:t>
       </w:r>
     </w:p>
     <w:p>
       <w:pPr>
-        <w:pStyle w:val="ListBullet"/>
+        <w:pStyle w:val="Heading3"/>
       </w:pPr>
       <w:r>
-        <w:rPr>
-          <w:rFonts w:ascii="Calibri" w:hAnsi="Calibri"/>
-          <w:sz w:val="22"/>
-        </w:rPr>
-        <w:t>Decision desk answers whether the file is ready for committee, what evidence supports the review, what questions remain and what human conditions are required.</w:t>
-      </w:r>
-    </w:p>
-    <w:p>
-      <w:pPr>
-        <w:pStyle w:val="ListBullet"/>
-      </w:pPr>
-      <w:r>
-        <w:rPr>
-          <w:rFonts w:ascii="Calibri" w:hAnsi="Calibri"/>
-          <w:sz w:val="22"/>
-        </w:rPr>
-        <w:t>Case management answers which cases are open, who owns them, what SLA applies, what evidence blocks progress and which follow-ups must be sent.</w:t>
+        <w:t>Agente para funding provider</w:t>
       </w:r>
     </w:p>
     <w:p>
@@ -593,7 +961,15 @@
           <w:rFonts w:ascii="Calibri" w:hAnsi="Calibri"/>
           <w:sz w:val="22"/>
         </w:rPr>
-        <w:t>Jurisdiction and country/state/city analysis:</w:t>
+        <w:t>Puede resumir, preparar preguntas de comite, explicar faltantes, comparar evidencia, redactar solicitudes y memo no vinculante. No puede aprobar, emitir term sheet vinculante, ignorar faltantes, consultar sin permisos ni enviar correos sin gate.</w:t>
+      </w:r>
+    </w:p>
+    <w:p>
+      <w:pPr>
+        <w:pStyle w:val="Heading1"/>
+      </w:pPr>
+      <w:r>
+        <w:t>6. Administracion</w:t>
       </w:r>
     </w:p>
     <w:p>
@@ -602,7 +978,15 @@
           <w:rFonts w:ascii="Calibri" w:hAnsi="Calibri"/>
           <w:sz w:val="22"/>
         </w:rPr>
-        <w:t>Funding providers need to understand where the project will operate. NUXERA should surface economic, political, social, regulatory and territorial context at country, state/province and city level when reliable data exists.</w:t>
+        <w:t>Admin controla usuarios, permisos, fuentes, agentes, notificaciones, seguridad, RLS, persistencia y cutover.</w:t>
+      </w:r>
+    </w:p>
+    <w:p>
+      <w:pPr>
+        <w:pStyle w:val="Heading3"/>
+      </w:pPr>
+      <w:r>
+        <w:t>Ingreso y modulos</w:t>
       </w:r>
     </w:p>
     <w:p>
@@ -611,7 +995,15 @@
           <w:rFonts w:ascii="Calibri" w:hAnsi="Calibri"/>
           <w:sz w:val="22"/>
         </w:rPr>
-        <w:t>The analysis should cover:</w:t>
+        <w:t>1. Iniciar sesion admin 2. Revisar Operations 3. Revisar Security/RLS 4. Revisar AI &amp; agents 5. Revisar System/deploys/gates 6. Revisar fuentes regulatorias</w:t>
+      </w:r>
+    </w:p>
+    <w:p>
+      <w:pPr>
+        <w:pStyle w:val="Heading3"/>
+      </w:pPr>
+      <w:r>
+        <w:t>Usuarios y permisos</w:t>
       </w:r>
     </w:p>
     <w:p>
@@ -623,7 +1015,7 @@
           <w:rFonts w:ascii="Calibri" w:hAnsi="Calibri"/>
           <w:sz w:val="22"/>
         </w:rPr>
-        <w:t>Economic conditions: growth, inflation, currency, FX exposure, relevant sectors, debt, foreign investment and macro stability.</w:t>
+        <w:t>Alta/baja de usuarios</w:t>
       </w:r>
     </w:p>
     <w:p>
@@ -635,7 +1027,7 @@
           <w:rFonts w:ascii="Calibri" w:hAnsi="Calibri"/>
           <w:sz w:val="22"/>
         </w:rPr>
-        <w:t>Political conditions: institutional stability, elections, regulatory changes, sanctions, conflict, perceived corruption and governance.</w:t>
+        <w:t>Roles applicant/funding provider/admin</w:t>
       </w:r>
     </w:p>
     <w:p>
@@ -647,7 +1039,7 @@
           <w:rFonts w:ascii="Calibri" w:hAnsi="Calibri"/>
           <w:sz w:val="22"/>
         </w:rPr>
-        <w:t>Social and territorial conditions: security, local conflict, permits, community risk, infrastructure, employment, poverty or local pressure.</w:t>
+        <w:t>Data rooms autorizados</w:t>
       </w:r>
     </w:p>
     <w:p>
@@ -659,7 +1051,7 @@
           <w:rFonts w:ascii="Calibri" w:hAnsi="Calibri"/>
           <w:sz w:val="22"/>
         </w:rPr>
-        <w:t>Regulatory conditions: public registers, licenses, restricted sectors, financial authorities, tax standing, beneficial owners and sanctions lists.</w:t>
+        <w:t>Separacion demo vs production</w:t>
       </w:r>
     </w:p>
     <w:p>
@@ -671,7 +1063,95 @@
           <w:rFonts w:ascii="Calibri" w:hAnsi="Calibri"/>
           <w:sz w:val="22"/>
         </w:rPr>
-        <w:t>Local granularity: province/state/city indicators where public data or reliable APIs can support the conclusion.</w:t>
+        <w:t>Revision de accesos antes de compartir evidencia</w:t>
+      </w:r>
+    </w:p>
+    <w:p>
+      <w:pPr>
+        <w:pStyle w:val="Heading3"/>
+      </w:pPr>
+      <w:r>
+        <w:t>Catalogo de fuentes</w:t>
+      </w:r>
+    </w:p>
+    <w:p>
+      <w:pPr>
+        <w:pStyle w:val="ListBullet"/>
+      </w:pPr>
+      <w:r>
+        <w:rPr>
+          <w:rFonts w:ascii="Calibri" w:hAnsi="Calibri"/>
+          <w:sz w:val="22"/>
+        </w:rPr>
+        <w:t>Nombre, pais, jurisdiccion y tipo de dato</w:t>
+      </w:r>
+    </w:p>
+    <w:p>
+      <w:pPr>
+        <w:pStyle w:val="ListBullet"/>
+      </w:pPr>
+      <w:r>
+        <w:rPr>
+          <w:rFonts w:ascii="Calibri" w:hAnsi="Calibri"/>
+          <w:sz w:val="22"/>
+        </w:rPr>
+        <w:t>Modo de acceso: publico, descarga, API, convenio o no disponible</w:t>
+      </w:r>
+    </w:p>
+    <w:p>
+      <w:pPr>
+        <w:pStyle w:val="ListBullet"/>
+      </w:pPr>
+      <w:r>
+        <w:rPr>
+          <w:rFonts w:ascii="Calibri" w:hAnsi="Calibri"/>
+          <w:sz w:val="22"/>
+        </w:rPr>
+        <w:t>Estatus live, condicional, privado, pendiente o bloqueado</w:t>
+      </w:r>
+    </w:p>
+    <w:p>
+      <w:pPr>
+        <w:pStyle w:val="ListBullet"/>
+      </w:pPr>
+      <w:r>
+        <w:rPr>
+          <w:rFonts w:ascii="Calibri" w:hAnsi="Calibri"/>
+          <w:sz w:val="22"/>
+        </w:rPr>
+        <w:t>Fecha de ultima revision y responsable</w:t>
+      </w:r>
+    </w:p>
+    <w:p>
+      <w:pPr>
+        <w:pStyle w:val="ListBullet"/>
+      </w:pPr>
+      <w:r>
+        <w:rPr>
+          <w:rFonts w:ascii="Calibri" w:hAnsi="Calibri"/>
+          <w:sz w:val="22"/>
+        </w:rPr>
+        <w:t>Limitaciones para no exagerar cobertura</w:t>
+      </w:r>
+    </w:p>
+    <w:p>
+      <w:pPr>
+        <w:pStyle w:val="ListBullet"/>
+      </w:pPr>
+      <w:r>
+        <w:rPr>
+          <w:rFonts w:ascii="Calibri" w:hAnsi="Calibri"/>
+          <w:sz w:val="22"/>
+        </w:rPr>
+        <w:t>Siguiente accion para integracion real</w:t>
+      </w:r>
+    </w:p>
+    <w:p>
+      <w:pPr>
+        <w:pStyle w:val="Heading3"/>
+      </w:pPr>
+      <w:r>
+        <w:t>Notificaciones</w:t>
       </w:r>
     </w:p>
     <w:p>
@@ -680,7 +1160,15 @@
           <w:rFonts w:ascii="Calibri" w:hAnsi="Calibri"/>
           <w:sz w:val="22"/>
         </w:rPr>
-        <w:t>Middle East and UAE regulatory coverage:</w:t>
+        <w:t>Eventos: bienvenida, file creado, documento faltante, documento recibido, observacion, aclaracion, estatus, nuevo file autorizado, evidencia nueva, SLA, revision humana, memo listo y riesgo critico. Fases: dry-run, sandbox, production limitada y production completa.</w:t>
+      </w:r>
+    </w:p>
+    <w:p>
+      <w:pPr>
+        <w:pStyle w:val="Heading3"/>
+      </w:pPr>
+      <w:r>
+        <w:t>Agentes e IA</w:t>
       </w:r>
     </w:p>
     <w:p>
@@ -689,7 +1177,15 @@
           <w:rFonts w:ascii="Calibri" w:hAnsi="Calibri"/>
           <w:sz w:val="22"/>
         </w:rPr>
-        <w:t>NUXERA models UAE PASS, EOCN, SCA/CMA, CBUAE, DFSA, FSRA/ADGM, ADGM Registration Authority, VARA, FTA, National Economic Registry and local economic departments as public, conditional or private sources. In the applicant workspace these sources should feed score, checklist and gaps quietly. In the funding provider workspace they should be explicit: source, scope, limitation, last review and next action.</w:t>
+        <w:t>OpenAI y Anthropic son principales; Kimi bajo costo/bajo riesgo; DeepSeek detras de principales y bajo riesgo; NVIDIA experimental. Admin ve proveedor, tareas permitidas, riesgo maximo, logs, runtime y fallas.</w:t>
+      </w:r>
+    </w:p>
+    <w:p>
+      <w:pPr>
+        <w:pStyle w:val="Heading3"/>
+      </w:pPr>
+      <w:r>
+        <w:t>Persistencia y cutover</w:t>
       </w:r>
     </w:p>
     <w:p>
@@ -698,7 +1194,7 @@
           <w:rFonts w:ascii="Calibri" w:hAnsi="Calibri"/>
           <w:sz w:val="22"/>
         </w:rPr>
-        <w:t>Expected result: faster, better structured and more defensible committee review with traceable evidence and clear human conditions.</w:t>
+        <w:t>Antes de production: eventos, aprobaciones, procedencia documental, RLS, tokens staging, logs y rollback. Cutover: inventario Nexus, QA, redireccion, monitoreo y plan de regreso.</w:t>
       </w:r>
     </w:p>
     <w:p>
@@ -706,7 +1202,7 @@
         <w:pStyle w:val="Heading1"/>
       </w:pPr>
       <w:r>
-        <w:t>5. Administration</w:t>
+        <w:t>7. Ciclo completo</w:t>
       </w:r>
     </w:p>
     <w:p>
@@ -715,7 +1211,15 @@
           <w:rFonts w:ascii="Calibri" w:hAnsi="Calibri"/>
           <w:sz w:val="22"/>
         </w:rPr>
-        <w:t>Administration controls operations, security, sources, agents, notifications, persistence and production readiness.</w:t>
+        <w:t>1. Applicant crea file 2. Carga datos y documents 3. NUXERA calcula readiness 4. Admin controla fuentes y gates 5. Funding Provider accede si esta autorizado 6. Funding Provider revisa evidencia y riesgos 7. Agente apoya bajo limites 8. Notificaciones mueven solicitudes 9. Persistencia registra eventos 10. Decision humana se documenta</w:t>
+      </w:r>
+    </w:p>
+    <w:p>
+      <w:pPr>
+        <w:pStyle w:val="Heading1"/>
+      </w:pPr>
+      <w:r>
+        <w:t>8. Matriz ampliada de documentos</w:t>
       </w:r>
     </w:p>
     <w:p>
@@ -724,7 +1228,7 @@
           <w:rFonts w:ascii="Calibri" w:hAnsi="Calibri"/>
           <w:sz w:val="22"/>
         </w:rPr>
-        <w:t>How to enter:</w:t>
+        <w:t>La operacion documental debe permitir que cada archivo tenga categoria, requisito asociado, version, fecha, responsable, estado y observacion. La plataforma debe evitar que un documento quede como archivo suelto sin relacion operativa.</w:t>
       </w:r>
     </w:p>
     <w:p>
@@ -733,7 +1237,151 @@
           <w:rFonts w:ascii="Calibri" w:hAnsi="Calibri"/>
           <w:sz w:val="22"/>
         </w:rPr>
-        <w:t>1. Sign in as administrator. 2. Open Operations for operating state. 3. Open Security for RLS, protected routes and authorization evidence. 4. Open AI &amp; agents for agent policy. 5. Open System for health, gates, sources and deployment posture.</w:t>
+        <w:t>Categorias:</w:t>
+      </w:r>
+    </w:p>
+    <w:p>
+      <w:pPr>
+        <w:pStyle w:val="ListBullet"/>
+      </w:pPr>
+      <w:r>
+        <w:rPr>
+          <w:rFonts w:ascii="Calibri" w:hAnsi="Calibri"/>
+          <w:sz w:val="22"/>
+        </w:rPr>
+        <w:t>Identidad</w:t>
+      </w:r>
+    </w:p>
+    <w:p>
+      <w:pPr>
+        <w:pStyle w:val="ListBullet"/>
+      </w:pPr>
+      <w:r>
+        <w:rPr>
+          <w:rFonts w:ascii="Calibri" w:hAnsi="Calibri"/>
+          <w:sz w:val="22"/>
+        </w:rPr>
+        <w:t>Corporativo</w:t>
+      </w:r>
+    </w:p>
+    <w:p>
+      <w:pPr>
+        <w:pStyle w:val="ListBullet"/>
+      </w:pPr>
+      <w:r>
+        <w:rPr>
+          <w:rFonts w:ascii="Calibri" w:hAnsi="Calibri"/>
+          <w:sz w:val="22"/>
+        </w:rPr>
+        <w:t>Fiscal</w:t>
+      </w:r>
+    </w:p>
+    <w:p>
+      <w:pPr>
+        <w:pStyle w:val="ListBullet"/>
+      </w:pPr>
+      <w:r>
+        <w:rPr>
+          <w:rFonts w:ascii="Calibri" w:hAnsi="Calibri"/>
+          <w:sz w:val="22"/>
+        </w:rPr>
+        <w:t>Financiero</w:t>
+      </w:r>
+    </w:p>
+    <w:p>
+      <w:pPr>
+        <w:pStyle w:val="ListBullet"/>
+      </w:pPr>
+      <w:r>
+        <w:rPr>
+          <w:rFonts w:ascii="Calibri" w:hAnsi="Calibri"/>
+          <w:sz w:val="22"/>
+        </w:rPr>
+        <w:t>Legal</w:t>
+      </w:r>
+    </w:p>
+    <w:p>
+      <w:pPr>
+        <w:pStyle w:val="ListBullet"/>
+      </w:pPr>
+      <w:r>
+        <w:rPr>
+          <w:rFonts w:ascii="Calibri" w:hAnsi="Calibri"/>
+          <w:sz w:val="22"/>
+        </w:rPr>
+        <w:t>Tecnico</w:t>
+      </w:r>
+    </w:p>
+    <w:p>
+      <w:pPr>
+        <w:pStyle w:val="ListBullet"/>
+      </w:pPr>
+      <w:r>
+        <w:rPr>
+          <w:rFonts w:ascii="Calibri" w:hAnsi="Calibri"/>
+          <w:sz w:val="22"/>
+        </w:rPr>
+        <w:t>Proyecto</w:t>
+      </w:r>
+    </w:p>
+    <w:p>
+      <w:pPr>
+        <w:pStyle w:val="ListBullet"/>
+      </w:pPr>
+      <w:r>
+        <w:rPr>
+          <w:rFonts w:ascii="Calibri" w:hAnsi="Calibri"/>
+          <w:sz w:val="22"/>
+        </w:rPr>
+        <w:t>Garantias</w:t>
+      </w:r>
+    </w:p>
+    <w:p>
+      <w:pPr>
+        <w:pStyle w:val="ListBullet"/>
+      </w:pPr>
+      <w:r>
+        <w:rPr>
+          <w:rFonts w:ascii="Calibri" w:hAnsi="Calibri"/>
+          <w:sz w:val="22"/>
+        </w:rPr>
+        <w:t>Cumplimiento</w:t>
+      </w:r>
+    </w:p>
+    <w:p>
+      <w:pPr>
+        <w:pStyle w:val="ListBullet"/>
+      </w:pPr>
+      <w:r>
+        <w:rPr>
+          <w:rFonts w:ascii="Calibri" w:hAnsi="Calibri"/>
+          <w:sz w:val="22"/>
+        </w:rPr>
+        <w:t>Regulatorio</w:t>
+      </w:r>
+    </w:p>
+    <w:p>
+      <w:pPr>
+        <w:pStyle w:val="ListBullet"/>
+      </w:pPr>
+      <w:r>
+        <w:rPr>
+          <w:rFonts w:ascii="Calibri" w:hAnsi="Calibri"/>
+          <w:sz w:val="22"/>
+        </w:rPr>
+        <w:t>Impacto ESG</w:t>
+      </w:r>
+    </w:p>
+    <w:p>
+      <w:pPr>
+        <w:pStyle w:val="ListBullet"/>
+      </w:pPr>
+      <w:r>
+        <w:rPr>
+          <w:rFonts w:ascii="Calibri" w:hAnsi="Calibri"/>
+          <w:sz w:val="22"/>
+        </w:rPr>
+        <w:t>Evidencia complementaria</w:t>
       </w:r>
     </w:p>
     <w:p>
@@ -742,7 +1390,7 @@
           <w:rFonts w:ascii="Calibri" w:hAnsi="Calibri"/>
           <w:sz w:val="22"/>
         </w:rPr>
-        <w:t>What admin does:</w:t>
+        <w:t>Estados posibles:</w:t>
       </w:r>
     </w:p>
     <w:p>
@@ -754,7 +1402,7 @@
           <w:rFonts w:ascii="Calibri" w:hAnsi="Calibri"/>
           <w:sz w:val="22"/>
         </w:rPr>
-        <w:t>Supervises users and permissions.</w:t>
+        <w:t>borrador</w:t>
       </w:r>
     </w:p>
     <w:p>
@@ -766,7 +1414,7 @@
           <w:rFonts w:ascii="Calibri" w:hAnsi="Calibri"/>
           <w:sz w:val="22"/>
         </w:rPr>
-        <w:t>Reviews protected modules.</w:t>
+        <w:t>recibido</w:t>
       </w:r>
     </w:p>
     <w:p>
@@ -778,7 +1426,7 @@
           <w:rFonts w:ascii="Calibri" w:hAnsi="Calibri"/>
           <w:sz w:val="22"/>
         </w:rPr>
-        <w:t>Manages regulatory source posture: live, public, private, agreement required or unavailable.</w:t>
+        <w:t>en revision</w:t>
       </w:r>
     </w:p>
     <w:p>
@@ -790,7 +1438,7 @@
           <w:rFonts w:ascii="Calibri" w:hAnsi="Calibri"/>
           <w:sz w:val="22"/>
         </w:rPr>
-        <w:t>Controls automatic notifications and email sandbox.</w:t>
+        <w:t>observado</w:t>
       </w:r>
     </w:p>
     <w:p>
@@ -802,7 +1450,7 @@
           <w:rFonts w:ascii="Calibri" w:hAnsi="Calibri"/>
           <w:sz w:val="22"/>
         </w:rPr>
-        <w:t>Defines conversational agent limits.</w:t>
+        <w:t>requiere aclaracion</w:t>
       </w:r>
     </w:p>
     <w:p>
@@ -814,7 +1462,7 @@
           <w:rFonts w:ascii="Calibri" w:hAnsi="Calibri"/>
           <w:sz w:val="22"/>
         </w:rPr>
-        <w:t>Reviews operational persistence before enabling real writes.</w:t>
+        <w:t>aprobado por revision humana</w:t>
       </w:r>
     </w:p>
     <w:p>
@@ -826,7 +1474,27 @@
           <w:rFonts w:ascii="Calibri" w:hAnsi="Calibri"/>
           <w:sz w:val="22"/>
         </w:rPr>
-        <w:t>Prepares cutover evidence from Nexus to NUXERA.</w:t>
+        <w:t>bloqueado</w:t>
+      </w:r>
+    </w:p>
+    <w:p>
+      <w:pPr>
+        <w:pStyle w:val="ListBullet"/>
+      </w:pPr>
+      <w:r>
+        <w:rPr>
+          <w:rFonts w:ascii="Calibri" w:hAnsi="Calibri"/>
+          <w:sz w:val="22"/>
+        </w:rPr>
+        <w:t>reemplazado por nueva version</w:t>
+      </w:r>
+    </w:p>
+    <w:p>
+      <w:pPr>
+        <w:pStyle w:val="Heading3"/>
+      </w:pPr>
+      <w:r>
+        <w:t>Documento - Identidad</w:t>
       </w:r>
     </w:p>
     <w:p>
@@ -835,7 +1503,7 @@
           <w:rFonts w:ascii="Calibri" w:hAnsi="Calibri"/>
           <w:sz w:val="22"/>
         </w:rPr>
-        <w:t>Notifications:</w:t>
+        <w:t>Funcion: acreditar informacion de tipo identidad. Paso a paso: 1. identificar requisito 2. subir archivo 3. asociar categoria 4. validar metadata 5. revisar completitud 6. marcar resultado 7. notificar faltante si aplica</w:t>
       </w:r>
     </w:p>
     <w:p>
@@ -844,7 +1512,15 @@
           <w:rFonts w:ascii="Calibri" w:hAnsi="Calibri"/>
           <w:sz w:val="22"/>
         </w:rPr>
-        <w:t>The notification service should email applicants and funding providers about file creation, missing documents, evidence requests, status changes, data room invitations, SLA reminders, risk alerts and human decisions. It must start in sandbox/dry-run mode with approved templates and without sensitive attachments.</w:t>
+        <w:t>Resultado esperado: el expediente muestra si esta evidencia esta completa, observada o bloqueada.</w:t>
+      </w:r>
+    </w:p>
+    <w:p>
+      <w:pPr>
+        <w:pStyle w:val="Heading3"/>
+      </w:pPr>
+      <w:r>
+        <w:t>Documento - Corporativo</w:t>
       </w:r>
     </w:p>
     <w:p>
@@ -853,7 +1529,7 @@
           <w:rFonts w:ascii="Calibri" w:hAnsi="Calibri"/>
           <w:sz w:val="22"/>
         </w:rPr>
-        <w:t>Agent/chat:</w:t>
+        <w:t>Funcion: acreditar informacion de tipo corporativo. Paso a paso: 1. identificar requisito 2. subir archivo 3. asociar categoria 4. validar metadata 5. revisar completitud 6. marcar resultado 7. notificar faltante si aplica</w:t>
       </w:r>
     </w:p>
     <w:p>
@@ -862,15 +1538,15 @@
           <w:rFonts w:ascii="Calibri" w:hAnsi="Calibri"/>
           <w:sz w:val="22"/>
         </w:rPr>
-        <w:t>The chat should explain requirements, summarize file state, identify risks, guide document upload and prepare committee questions. It should be grounded in authorized data: file metadata, checklist, permitted documents, timeline, regulatory sources and jurisdictional context. It must not invent evidence, approve transactions, send email without authorization or expose another user's data.</w:t>
+        <w:t>Resultado esperado: el expediente muestra si esta evidencia esta completa, observada o bloqueada.</w:t>
       </w:r>
     </w:p>
     <w:p>
       <w:pPr>
-        <w:pStyle w:val="Heading1"/>
+        <w:pStyle w:val="Heading3"/>
       </w:pPr>
       <w:r>
-        <w:t>6. Overall Result</w:t>
+        <w:t>Documento - Fiscal</w:t>
       </w:r>
     </w:p>
     <w:p>
@@ -879,7 +1555,634 @@
           <w:rFonts w:ascii="Calibri" w:hAnsi="Calibri"/>
           <w:sz w:val="22"/>
         </w:rPr>
-        <w:t>NUXERA is investor-ready as a demonstrable live product experience. Full production operation still requires controlled real-data testing, RLS phase 2 evidence, final SQL persistence, email sandbox/live provider approval, cutover decision and agreements/APIs for private regulatory sources.</w:t>
+        <w:t>Funcion: acreditar informacion de tipo fiscal. Paso a paso: 1. identificar requisito 2. subir archivo 3. asociar categoria 4. validar metadata 5. revisar completitud 6. marcar resultado 7. notificar faltante si aplica</w:t>
+      </w:r>
+    </w:p>
+    <w:p>
+      <w:r>
+        <w:rPr>
+          <w:rFonts w:ascii="Calibri" w:hAnsi="Calibri"/>
+          <w:sz w:val="22"/>
+        </w:rPr>
+        <w:t>Resultado esperado: el expediente muestra si esta evidencia esta completa, observada o bloqueada.</w:t>
+      </w:r>
+    </w:p>
+    <w:p>
+      <w:pPr>
+        <w:pStyle w:val="Heading3"/>
+      </w:pPr>
+      <w:r>
+        <w:t>Documento - Financiero</w:t>
+      </w:r>
+    </w:p>
+    <w:p>
+      <w:r>
+        <w:rPr>
+          <w:rFonts w:ascii="Calibri" w:hAnsi="Calibri"/>
+          <w:sz w:val="22"/>
+        </w:rPr>
+        <w:t>Funcion: acreditar informacion de tipo financiero. Paso a paso: 1. identificar requisito 2. subir archivo 3. asociar categoria 4. validar metadata 5. revisar completitud 6. marcar resultado 7. notificar faltante si aplica</w:t>
+      </w:r>
+    </w:p>
+    <w:p>
+      <w:r>
+        <w:rPr>
+          <w:rFonts w:ascii="Calibri" w:hAnsi="Calibri"/>
+          <w:sz w:val="22"/>
+        </w:rPr>
+        <w:t>Resultado esperado: el expediente muestra si esta evidencia esta completa, observada o bloqueada.</w:t>
+      </w:r>
+    </w:p>
+    <w:p>
+      <w:pPr>
+        <w:pStyle w:val="Heading3"/>
+      </w:pPr>
+      <w:r>
+        <w:t>Documento - Legal</w:t>
+      </w:r>
+    </w:p>
+    <w:p>
+      <w:r>
+        <w:rPr>
+          <w:rFonts w:ascii="Calibri" w:hAnsi="Calibri"/>
+          <w:sz w:val="22"/>
+        </w:rPr>
+        <w:t>Funcion: acreditar informacion de tipo legal. Paso a paso: 1. identificar requisito 2. subir archivo 3. asociar categoria 4. validar metadata 5. revisar completitud 6. marcar resultado 7. notificar faltante si aplica</w:t>
+      </w:r>
+    </w:p>
+    <w:p>
+      <w:r>
+        <w:rPr>
+          <w:rFonts w:ascii="Calibri" w:hAnsi="Calibri"/>
+          <w:sz w:val="22"/>
+        </w:rPr>
+        <w:t>Resultado esperado: el expediente muestra si esta evidencia esta completa, observada o bloqueada.</w:t>
+      </w:r>
+    </w:p>
+    <w:p>
+      <w:pPr>
+        <w:pStyle w:val="Heading3"/>
+      </w:pPr>
+      <w:r>
+        <w:t>Documento - Tecnico</w:t>
+      </w:r>
+    </w:p>
+    <w:p>
+      <w:r>
+        <w:rPr>
+          <w:rFonts w:ascii="Calibri" w:hAnsi="Calibri"/>
+          <w:sz w:val="22"/>
+        </w:rPr>
+        <w:t>Funcion: acreditar informacion de tipo tecnico. Paso a paso: 1. identificar requisito 2. subir archivo 3. asociar categoria 4. validar metadata 5. revisar completitud 6. marcar resultado 7. notificar faltante si aplica</w:t>
+      </w:r>
+    </w:p>
+    <w:p>
+      <w:r>
+        <w:rPr>
+          <w:rFonts w:ascii="Calibri" w:hAnsi="Calibri"/>
+          <w:sz w:val="22"/>
+        </w:rPr>
+        <w:t>Resultado esperado: el expediente muestra si esta evidencia esta completa, observada o bloqueada.</w:t>
+      </w:r>
+    </w:p>
+    <w:p>
+      <w:pPr>
+        <w:pStyle w:val="Heading3"/>
+      </w:pPr>
+      <w:r>
+        <w:t>Documento - Proyecto</w:t>
+      </w:r>
+    </w:p>
+    <w:p>
+      <w:r>
+        <w:rPr>
+          <w:rFonts w:ascii="Calibri" w:hAnsi="Calibri"/>
+          <w:sz w:val="22"/>
+        </w:rPr>
+        <w:t>Funcion: acreditar informacion de tipo proyecto. Paso a paso: 1. identificar requisito 2. subir archivo 3. asociar categoria 4. validar metadata 5. revisar completitud 6. marcar resultado 7. notificar faltante si aplica</w:t>
+      </w:r>
+    </w:p>
+    <w:p>
+      <w:r>
+        <w:rPr>
+          <w:rFonts w:ascii="Calibri" w:hAnsi="Calibri"/>
+          <w:sz w:val="22"/>
+        </w:rPr>
+        <w:t>Resultado esperado: el expediente muestra si esta evidencia esta completa, observada o bloqueada.</w:t>
+      </w:r>
+    </w:p>
+    <w:p>
+      <w:pPr>
+        <w:pStyle w:val="Heading3"/>
+      </w:pPr>
+      <w:r>
+        <w:t>Documento - Garantias</w:t>
+      </w:r>
+    </w:p>
+    <w:p>
+      <w:r>
+        <w:rPr>
+          <w:rFonts w:ascii="Calibri" w:hAnsi="Calibri"/>
+          <w:sz w:val="22"/>
+        </w:rPr>
+        <w:t>Funcion: acreditar informacion de tipo garantias. Paso a paso: 1. identificar requisito 2. subir archivo 3. asociar categoria 4. validar metadata 5. revisar completitud 6. marcar resultado 7. notificar faltante si aplica</w:t>
+      </w:r>
+    </w:p>
+    <w:p>
+      <w:r>
+        <w:rPr>
+          <w:rFonts w:ascii="Calibri" w:hAnsi="Calibri"/>
+          <w:sz w:val="22"/>
+        </w:rPr>
+        <w:t>Resultado esperado: el expediente muestra si esta evidencia esta completa, observada o bloqueada.</w:t>
+      </w:r>
+    </w:p>
+    <w:p>
+      <w:pPr>
+        <w:pStyle w:val="Heading3"/>
+      </w:pPr>
+      <w:r>
+        <w:t>Documento - Cumplimiento</w:t>
+      </w:r>
+    </w:p>
+    <w:p>
+      <w:r>
+        <w:rPr>
+          <w:rFonts w:ascii="Calibri" w:hAnsi="Calibri"/>
+          <w:sz w:val="22"/>
+        </w:rPr>
+        <w:t>Funcion: acreditar informacion de tipo cumplimiento. Paso a paso: 1. identificar requisito 2. subir archivo 3. asociar categoria 4. validar metadata 5. revisar completitud 6. marcar resultado 7. notificar faltante si aplica</w:t>
+      </w:r>
+    </w:p>
+    <w:p>
+      <w:r>
+        <w:rPr>
+          <w:rFonts w:ascii="Calibri" w:hAnsi="Calibri"/>
+          <w:sz w:val="22"/>
+        </w:rPr>
+        <w:t>Resultado esperado: el expediente muestra si esta evidencia esta completa, observada o bloqueada.</w:t>
+      </w:r>
+    </w:p>
+    <w:p>
+      <w:pPr>
+        <w:pStyle w:val="Heading3"/>
+      </w:pPr>
+      <w:r>
+        <w:t>Documento - Regulatorio</w:t>
+      </w:r>
+    </w:p>
+    <w:p>
+      <w:r>
+        <w:rPr>
+          <w:rFonts w:ascii="Calibri" w:hAnsi="Calibri"/>
+          <w:sz w:val="22"/>
+        </w:rPr>
+        <w:t>Funcion: acreditar informacion de tipo regulatorio. Paso a paso: 1. identificar requisito 2. subir archivo 3. asociar categoria 4. validar metadata 5. revisar completitud 6. marcar resultado 7. notificar faltante si aplica</w:t>
+      </w:r>
+    </w:p>
+    <w:p>
+      <w:r>
+        <w:rPr>
+          <w:rFonts w:ascii="Calibri" w:hAnsi="Calibri"/>
+          <w:sz w:val="22"/>
+        </w:rPr>
+        <w:t>Resultado esperado: el expediente muestra si esta evidencia esta completa, observada o bloqueada.</w:t>
+      </w:r>
+    </w:p>
+    <w:p>
+      <w:pPr>
+        <w:pStyle w:val="Heading3"/>
+      </w:pPr>
+      <w:r>
+        <w:t>Documento - Impacto ESG</w:t>
+      </w:r>
+    </w:p>
+    <w:p>
+      <w:r>
+        <w:rPr>
+          <w:rFonts w:ascii="Calibri" w:hAnsi="Calibri"/>
+          <w:sz w:val="22"/>
+        </w:rPr>
+        <w:t>Funcion: acreditar informacion de tipo impacto esg. Paso a paso: 1. identificar requisito 2. subir archivo 3. asociar categoria 4. validar metadata 5. revisar completitud 6. marcar resultado 7. notificar faltante si aplica</w:t>
+      </w:r>
+    </w:p>
+    <w:p>
+      <w:r>
+        <w:rPr>
+          <w:rFonts w:ascii="Calibri" w:hAnsi="Calibri"/>
+          <w:sz w:val="22"/>
+        </w:rPr>
+        <w:t>Resultado esperado: el expediente muestra si esta evidencia esta completa, observada o bloqueada.</w:t>
+      </w:r>
+    </w:p>
+    <w:p>
+      <w:pPr>
+        <w:pStyle w:val="Heading3"/>
+      </w:pPr>
+      <w:r>
+        <w:t>Documento - Evidencia complementaria</w:t>
+      </w:r>
+    </w:p>
+    <w:p>
+      <w:r>
+        <w:rPr>
+          <w:rFonts w:ascii="Calibri" w:hAnsi="Calibri"/>
+          <w:sz w:val="22"/>
+        </w:rPr>
+        <w:t>Funcion: acreditar informacion de tipo evidencia complementaria. Paso a paso: 1. identificar requisito 2. subir archivo 3. asociar categoria 4. validar metadata 5. revisar completitud 6. marcar resultado 7. notificar faltante si aplica</w:t>
+      </w:r>
+    </w:p>
+    <w:p>
+      <w:r>
+        <w:rPr>
+          <w:rFonts w:ascii="Calibri" w:hAnsi="Calibri"/>
+          <w:sz w:val="22"/>
+        </w:rPr>
+        <w:t>Resultado esperado: el expediente muestra si esta evidencia esta completa, observada o bloqueada.</w:t>
+      </w:r>
+    </w:p>
+    <w:p>
+      <w:pPr>
+        <w:pStyle w:val="Heading1"/>
+      </w:pPr>
+      <w:r>
+        <w:t>9. Flujos operativos por rol</w:t>
+      </w:r>
+    </w:p>
+    <w:p>
+      <w:r>
+        <w:rPr>
+          <w:rFonts w:ascii="Calibri" w:hAnsi="Calibri"/>
+          <w:sz w:val="22"/>
+        </w:rPr>
+        <w:t>Cada rol opera una parte distinta del ciclo. El valor de NUXERA esta en que estos ciclos se conectan sin mezclar permisos.</w:t>
+      </w:r>
+    </w:p>
+    <w:p>
+      <w:pPr>
+        <w:pStyle w:val="Heading3"/>
+      </w:pPr>
+      <w:r>
+        <w:t>Flujo de solicitante</w:t>
+      </w:r>
+    </w:p>
+    <w:p>
+      <w:r>
+        <w:rPr>
+          <w:rFonts w:ascii="Calibri" w:hAnsi="Calibri"/>
+          <w:sz w:val="22"/>
+        </w:rPr>
+        <w:t>1. entra con rol correcto 2. consulta solo informacion permitida 3. ejecuta accion propia del rol 4. genera evento trazable 5. recibe o dispara notificacion si aplica 6. deja evidencia para auditoria</w:t>
+      </w:r>
+    </w:p>
+    <w:p>
+      <w:r>
+        <w:rPr>
+          <w:rFonts w:ascii="Calibri" w:hAnsi="Calibri"/>
+          <w:sz w:val="22"/>
+        </w:rPr>
+        <w:t>Riesgo a evitar: que solicitante opere fuera de su alcance o vea datos que no corresponden.</w:t>
+      </w:r>
+    </w:p>
+    <w:p>
+      <w:pPr>
+        <w:pStyle w:val="Heading3"/>
+      </w:pPr>
+      <w:r>
+        <w:t>Flujo de otorgante</w:t>
+      </w:r>
+    </w:p>
+    <w:p>
+      <w:r>
+        <w:rPr>
+          <w:rFonts w:ascii="Calibri" w:hAnsi="Calibri"/>
+          <w:sz w:val="22"/>
+        </w:rPr>
+        <w:t>1. entra con rol correcto 2. consulta solo informacion permitida 3. ejecuta accion propia del rol 4. genera evento trazable 5. recibe o dispara notificacion si aplica 6. deja evidencia para auditoria</w:t>
+      </w:r>
+    </w:p>
+    <w:p>
+      <w:r>
+        <w:rPr>
+          <w:rFonts w:ascii="Calibri" w:hAnsi="Calibri"/>
+          <w:sz w:val="22"/>
+        </w:rPr>
+        <w:t>Riesgo a evitar: que otorgante opere fuera de su alcance o vea datos que no corresponden.</w:t>
+      </w:r>
+    </w:p>
+    <w:p>
+      <w:pPr>
+        <w:pStyle w:val="Heading3"/>
+      </w:pPr>
+      <w:r>
+        <w:t>Flujo de administrador</w:t>
+      </w:r>
+    </w:p>
+    <w:p>
+      <w:r>
+        <w:rPr>
+          <w:rFonts w:ascii="Calibri" w:hAnsi="Calibri"/>
+          <w:sz w:val="22"/>
+        </w:rPr>
+        <w:t>1. entra con rol correcto 2. consulta solo informacion permitida 3. ejecuta accion propia del rol 4. genera evento trazable 5. recibe o dispara notificacion si aplica 6. deja evidencia para auditoria</w:t>
+      </w:r>
+    </w:p>
+    <w:p>
+      <w:r>
+        <w:rPr>
+          <w:rFonts w:ascii="Calibri" w:hAnsi="Calibri"/>
+          <w:sz w:val="22"/>
+        </w:rPr>
+        <w:t>Riesgo a evitar: que administrador opere fuera de su alcance o vea datos que no corresponden.</w:t>
+      </w:r>
+    </w:p>
+    <w:p>
+      <w:pPr>
+        <w:pStyle w:val="Heading3"/>
+      </w:pPr>
+      <w:r>
+        <w:t>Flujo de agente</w:t>
+      </w:r>
+    </w:p>
+    <w:p>
+      <w:r>
+        <w:rPr>
+          <w:rFonts w:ascii="Calibri" w:hAnsi="Calibri"/>
+          <w:sz w:val="22"/>
+        </w:rPr>
+        <w:t>1. entra con rol correcto 2. consulta solo informacion permitida 3. ejecuta accion propia del rol 4. genera evento trazable 5. recibe o dispara notificacion si aplica 6. deja evidencia para auditoria</w:t>
+      </w:r>
+    </w:p>
+    <w:p>
+      <w:r>
+        <w:rPr>
+          <w:rFonts w:ascii="Calibri" w:hAnsi="Calibri"/>
+          <w:sz w:val="22"/>
+        </w:rPr>
+        <w:t>Riesgo a evitar: que agente opere fuera de su alcance o vea datos que no corresponden.</w:t>
+      </w:r>
+    </w:p>
+    <w:p>
+      <w:pPr>
+        <w:pStyle w:val="Heading3"/>
+      </w:pPr>
+      <w:r>
+        <w:t>Flujo de servicio de notificaciones</w:t>
+      </w:r>
+    </w:p>
+    <w:p>
+      <w:r>
+        <w:rPr>
+          <w:rFonts w:ascii="Calibri" w:hAnsi="Calibri"/>
+          <w:sz w:val="22"/>
+        </w:rPr>
+        <w:t>1. entra con rol correcto 2. consulta solo informacion permitida 3. ejecuta accion propia del rol 4. genera evento trazable 5. recibe o dispara notificacion si aplica 6. deja evidencia para auditoria</w:t>
+      </w:r>
+    </w:p>
+    <w:p>
+      <w:r>
+        <w:rPr>
+          <w:rFonts w:ascii="Calibri" w:hAnsi="Calibri"/>
+          <w:sz w:val="22"/>
+        </w:rPr>
+        <w:t>Riesgo a evitar: que servicio de notificaciones opere fuera de su alcance o vea datos que no corresponden.</w:t>
+      </w:r>
+    </w:p>
+    <w:p>
+      <w:pPr>
+        <w:pStyle w:val="Heading1"/>
+      </w:pPr>
+      <w:r>
+        <w:t>10. Escenarios practicos de uso</w:t>
+      </w:r>
+    </w:p>
+    <w:p>
+      <w:r>
+        <w:rPr>
+          <w:rFonts w:ascii="Calibri" w:hAnsi="Calibri"/>
+          <w:sz w:val="22"/>
+        </w:rPr>
+        <w:t>Escenario 1: solicitante incompleto. La plataforma debe mostrar brechas, documentos faltantes y acciones. Escenario 2: expediente listo con observaciones. Debe permitir revision humana. Escenario 3: otorgante detecta riesgo jurisdiccional. Debe pedir evidencia y preparar pregunta de comite. Escenario 4: admin detecta fuente condicional. Debe marcar limitacion y evitar presentarla como live. Escenario 5: agente no tiene contexto. Debe decir que no cuenta con evidencia suficiente.</w:t>
+      </w:r>
+    </w:p>
+    <w:p>
+      <w:pPr>
+        <w:pStyle w:val="Heading1"/>
+      </w:pPr>
+      <w:r>
+        <w:t>11. Errores frecuentes y manejo esperado</w:t>
+      </w:r>
+    </w:p>
+    <w:p>
+      <w:pPr>
+        <w:pStyle w:val="ListBullet"/>
+      </w:pPr>
+      <w:r>
+        <w:rPr>
+          <w:rFonts w:ascii="Calibri" w:hAnsi="Calibri"/>
+          <w:sz w:val="22"/>
+        </w:rPr>
+        <w:t>Documento subido en categoria incorrecta: marcar observacion y pedir reclasificacion</w:t>
+      </w:r>
+    </w:p>
+    <w:p>
+      <w:pPr>
+        <w:pStyle w:val="ListBullet"/>
+      </w:pPr>
+      <w:r>
+        <w:rPr>
+          <w:rFonts w:ascii="Calibri" w:hAnsi="Calibri"/>
+          <w:sz w:val="22"/>
+        </w:rPr>
+        <w:t>Modelo financiero desactualizado: pedir nueva version</w:t>
+      </w:r>
+    </w:p>
+    <w:p>
+      <w:pPr>
+        <w:pStyle w:val="ListBullet"/>
+      </w:pPr>
+      <w:r>
+        <w:rPr>
+          <w:rFonts w:ascii="Calibri" w:hAnsi="Calibri"/>
+          <w:sz w:val="22"/>
+        </w:rPr>
+        <w:t>Ubicacion incompleta: bloquear analisis jurisdiccional profundo</w:t>
+      </w:r>
+    </w:p>
+    <w:p>
+      <w:pPr>
+        <w:pStyle w:val="ListBullet"/>
+      </w:pPr>
+      <w:r>
+        <w:rPr>
+          <w:rFonts w:ascii="Calibri" w:hAnsi="Calibri"/>
+          <w:sz w:val="22"/>
+        </w:rPr>
+        <w:t>Beneficiario final no identificado: marcar riesgo critico</w:t>
+      </w:r>
+    </w:p>
+    <w:p>
+      <w:pPr>
+        <w:pStyle w:val="ListBullet"/>
+      </w:pPr>
+      <w:r>
+        <w:rPr>
+          <w:rFonts w:ascii="Calibri" w:hAnsi="Calibri"/>
+          <w:sz w:val="22"/>
+        </w:rPr>
+        <w:t>Fuente regulatoria privada sin convenio: mostrar pendiente, no live</w:t>
+      </w:r>
+    </w:p>
+    <w:p>
+      <w:pPr>
+        <w:pStyle w:val="ListBullet"/>
+      </w:pPr>
+      <w:r>
+        <w:rPr>
+          <w:rFonts w:ascii="Calibri" w:hAnsi="Calibri"/>
+          <w:sz w:val="22"/>
+        </w:rPr>
+        <w:t>Otorgante sin autorizacion: denegar acceso</w:t>
+      </w:r>
+    </w:p>
+    <w:p>
+      <w:pPr>
+        <w:pStyle w:val="ListBullet"/>
+      </w:pPr>
+      <w:r>
+        <w:rPr>
+          <w:rFonts w:ascii="Calibri" w:hAnsi="Calibri"/>
+          <w:sz w:val="22"/>
+        </w:rPr>
+        <w:t>Correo con evidencia sensible: bloquear envio por defecto</w:t>
+      </w:r>
+    </w:p>
+    <w:p>
+      <w:pPr>
+        <w:pStyle w:val="Heading1"/>
+      </w:pPr>
+      <w:r>
+        <w:t>12. Resultado por seccion</w:t>
+      </w:r>
+    </w:p>
+    <w:p>
+      <w:pPr>
+        <w:pStyle w:val="ListBullet"/>
+      </w:pPr>
+      <w:r>
+        <w:rPr>
+          <w:rFonts w:ascii="Calibri" w:hAnsi="Calibri"/>
+          <w:sz w:val="22"/>
+        </w:rPr>
+        <w:t>Pagina publica: entendimiento comercial</w:t>
+      </w:r>
+    </w:p>
+    <w:p>
+      <w:pPr>
+        <w:pStyle w:val="ListBullet"/>
+      </w:pPr>
+      <w:r>
+        <w:rPr>
+          <w:rFonts w:ascii="Calibri" w:hAnsi="Calibri"/>
+          <w:sz w:val="22"/>
+        </w:rPr>
+        <w:t>Solicitante: expediente preparado</w:t>
+      </w:r>
+    </w:p>
+    <w:p>
+      <w:pPr>
+        <w:pStyle w:val="ListBullet"/>
+      </w:pPr>
+      <w:r>
+        <w:rPr>
+          <w:rFonts w:ascii="Calibri" w:hAnsi="Calibri"/>
+          <w:sz w:val="22"/>
+        </w:rPr>
+        <w:t>Documentos: evidencia clasificada</w:t>
+      </w:r>
+    </w:p>
+    <w:p>
+      <w:pPr>
+        <w:pStyle w:val="ListBullet"/>
+      </w:pPr>
+      <w:r>
+        <w:rPr>
+          <w:rFonts w:ascii="Calibri" w:hAnsi="Calibri"/>
+          <w:sz w:val="22"/>
+        </w:rPr>
+        <w:t>Readiness: brechas visibles</w:t>
+      </w:r>
+    </w:p>
+    <w:p>
+      <w:pPr>
+        <w:pStyle w:val="ListBullet"/>
+      </w:pPr>
+      <w:r>
+        <w:rPr>
+          <w:rFonts w:ascii="Calibri" w:hAnsi="Calibri"/>
+          <w:sz w:val="22"/>
+        </w:rPr>
+        <w:t>Otorgante: paquete de decision no vinculante</w:t>
+      </w:r>
+    </w:p>
+    <w:p>
+      <w:pPr>
+        <w:pStyle w:val="ListBullet"/>
+      </w:pPr>
+      <w:r>
+        <w:rPr>
+          <w:rFonts w:ascii="Calibri" w:hAnsi="Calibri"/>
+          <w:sz w:val="22"/>
+        </w:rPr>
+        <w:t>Case management: seguimiento y SLA</w:t>
+      </w:r>
+    </w:p>
+    <w:p>
+      <w:pPr>
+        <w:pStyle w:val="ListBullet"/>
+      </w:pPr>
+      <w:r>
+        <w:rPr>
+          <w:rFonts w:ascii="Calibri" w:hAnsi="Calibri"/>
+          <w:sz w:val="22"/>
+        </w:rPr>
+        <w:t>Jurisdiccion: contexto pais/ciudad trazable</w:t>
+      </w:r>
+    </w:p>
+    <w:p>
+      <w:pPr>
+        <w:pStyle w:val="ListBullet"/>
+      </w:pPr>
+      <w:r>
+        <w:rPr>
+          <w:rFonts w:ascii="Calibri" w:hAnsi="Calibri"/>
+          <w:sz w:val="22"/>
+        </w:rPr>
+        <w:t>Admin: control operativo</w:t>
+      </w:r>
+    </w:p>
+    <w:p>
+      <w:pPr>
+        <w:pStyle w:val="ListBullet"/>
+      </w:pPr>
+      <w:r>
+        <w:rPr>
+          <w:rFonts w:ascii="Calibri" w:hAnsi="Calibri"/>
+          <w:sz w:val="22"/>
+        </w:rPr>
+        <w:t>Agente: asistencia limitada por contexto</w:t>
+      </w:r>
+    </w:p>
+    <w:p>
+      <w:pPr>
+        <w:pStyle w:val="ListBullet"/>
+      </w:pPr>
+      <w:r>
+        <w:rPr>
+          <w:rFonts w:ascii="Calibri" w:hAnsi="Calibri"/>
+          <w:sz w:val="22"/>
+        </w:rPr>
+        <w:t>Notificaciones: movimiento operativo sin exponer evidencia</w:t>
       </w:r>
     </w:p>
     <w:sectPr>

</xml_diff>